<commit_message>
Actualizadas las imágenes de las resistencias con bandas de color más anchas
</commit_message>
<xml_diff>
--- a/build/es_electric_digital.docx
+++ b/build/es_electric_digital.docx
@@ -64,7 +64,7 @@
       <w:r>
         <w:t>a)</w:t>
         <w:tab/>
-        <w:t>Puerta AND</w:t>
+        <w:t>Puerta NOT</w:t>
       </w:r>
     </w:p>
     <w:p>
@@ -94,7 +94,7 @@
       <w:r>
         <w:t>d)</w:t>
         <w:tab/>
-        <w:t>Puerta NOT</w:t>
+        <w:t>Puerta AND</w:t>
       </w:r>
     </w:p>
     <w:p>
@@ -151,7 +151,7 @@
       <w:r>
         <w:t>a)</w:t>
         <w:tab/>
-        <w:t>Puerta XOR</w:t>
+        <w:t>Puerta NOR</w:t>
       </w:r>
     </w:p>
     <w:p>
@@ -161,7 +161,7 @@
       <w:r>
         <w:t>b)</w:t>
         <w:tab/>
-        <w:t>Puerta NOR</w:t>
+        <w:t>Puerta XOR</w:t>
       </w:r>
     </w:p>
     <w:p>
@@ -238,6 +238,16 @@
       <w:r>
         <w:t>a)</w:t>
         <w:tab/>
+        <w:t>Puerta OR</w:t>
+      </w:r>
+    </w:p>
+    <w:p>
+      <w:pPr>
+        <w:pStyle w:val="Choice"/>
+      </w:pPr>
+      <w:r>
+        <w:t>b)</w:t>
+        <w:tab/>
         <w:t>Puerta XOR</w:t>
       </w:r>
     </w:p>
@@ -246,9 +256,9 @@
         <w:pStyle w:val="Choice"/>
       </w:pPr>
       <w:r>
-        <w:t>b)</w:t>
+        <w:t>c)</w:t>
         <w:tab/>
-        <w:t>Puerta OR</w:t>
+        <w:t>Puerta NOT</w:t>
       </w:r>
     </w:p>
     <w:p>
@@ -256,19 +266,9 @@
         <w:pStyle w:val="Choice"/>
       </w:pPr>
       <w:r>
-        <w:t>c)</w:t>
+        <w:t>d)</w:t>
         <w:tab/>
         <w:t>Puerta AND</w:t>
-      </w:r>
-    </w:p>
-    <w:p>
-      <w:pPr>
-        <w:pStyle w:val="Choice"/>
-      </w:pPr>
-      <w:r>
-        <w:t>d)</w:t>
-        <w:tab/>
-        <w:t>Puerta NOT</w:t>
       </w:r>
     </w:p>
     <w:p>
@@ -325,6 +325,26 @@
       <w:r>
         <w:t>a)</w:t>
         <w:tab/>
+        <w:t>Puerta NAND</w:t>
+      </w:r>
+    </w:p>
+    <w:p>
+      <w:pPr>
+        <w:pStyle w:val="Choice"/>
+      </w:pPr>
+      <w:r>
+        <w:t>b)</w:t>
+        <w:tab/>
+        <w:t>Puerta NOR</w:t>
+      </w:r>
+    </w:p>
+    <w:p>
+      <w:pPr>
+        <w:pStyle w:val="Choice"/>
+      </w:pPr>
+      <w:r>
+        <w:t>c)</w:t>
+        <w:tab/>
         <w:t>Puerta NOT</w:t>
       </w:r>
     </w:p>
@@ -333,29 +353,9 @@
         <w:pStyle w:val="Choice"/>
       </w:pPr>
       <w:r>
-        <w:t>b)</w:t>
+        <w:t>d)</w:t>
         <w:tab/>
         <w:t>Puerta XOR</w:t>
-      </w:r>
-    </w:p>
-    <w:p>
-      <w:pPr>
-        <w:pStyle w:val="Choice"/>
-      </w:pPr>
-      <w:r>
-        <w:t>c)</w:t>
-        <w:tab/>
-        <w:t>Puerta NAND</w:t>
-      </w:r>
-    </w:p>
-    <w:p>
-      <w:pPr>
-        <w:pStyle w:val="Choice"/>
-      </w:pPr>
-      <w:r>
-        <w:t>d)</w:t>
-        <w:tab/>
-        <w:t>Puerta NOR</w:t>
       </w:r>
     </w:p>
     <w:p>
@@ -412,6 +412,16 @@
       <w:r>
         <w:t>a)</w:t>
         <w:tab/>
+        <w:t>Puerta NOT</w:t>
+      </w:r>
+    </w:p>
+    <w:p>
+      <w:pPr>
+        <w:pStyle w:val="Choice"/>
+      </w:pPr>
+      <w:r>
+        <w:t>b)</w:t>
+        <w:tab/>
         <w:t>Puerta XOR</w:t>
       </w:r>
     </w:p>
@@ -420,9 +430,9 @@
         <w:pStyle w:val="Choice"/>
       </w:pPr>
       <w:r>
-        <w:t>b)</w:t>
+        <w:t>c)</w:t>
         <w:tab/>
-        <w:t>Puerta AND</w:t>
+        <w:t>Puerta OR</w:t>
       </w:r>
     </w:p>
     <w:p>
@@ -430,19 +440,9 @@
         <w:pStyle w:val="Choice"/>
       </w:pPr>
       <w:r>
-        <w:t>c)</w:t>
-        <w:tab/>
-        <w:t>Puerta NOT</w:t>
-      </w:r>
-    </w:p>
-    <w:p>
-      <w:pPr>
-        <w:pStyle w:val="Choice"/>
-      </w:pPr>
-      <w:r>
         <w:t>d)</w:t>
         <w:tab/>
-        <w:t>Puerta OR</w:t>
+        <w:t>Puerta AND</w:t>
       </w:r>
     </w:p>
     <w:p>
@@ -509,7 +509,7 @@
       <w:r>
         <w:t>b)</w:t>
         <w:tab/>
-        <w:t>Puerta XOR</w:t>
+        <w:t>Puerta NOR</w:t>
       </w:r>
     </w:p>
     <w:p>
@@ -519,7 +519,7 @@
       <w:r>
         <w:t>c)</w:t>
         <w:tab/>
-        <w:t>Puerta NOR</w:t>
+        <w:t>Puerta XOR</w:t>
       </w:r>
     </w:p>
     <w:p>
@@ -547,16 +547,6 @@
       <w:r>
         <w:t>a)</w:t>
         <w:tab/>
-        <w:t>El condensador</w:t>
-      </w:r>
-    </w:p>
-    <w:p>
-      <w:pPr>
-        <w:pStyle w:val="Choice"/>
-      </w:pPr>
-      <w:r>
-        <w:t>b)</w:t>
-        <w:tab/>
         <w:t>El transistor</w:t>
       </w:r>
     </w:p>
@@ -565,9 +555,19 @@
         <w:pStyle w:val="Choice"/>
       </w:pPr>
       <w:r>
+        <w:t>b)</w:t>
+        <w:tab/>
+        <w:t>El transmisor</w:t>
+      </w:r>
+    </w:p>
+    <w:p>
+      <w:pPr>
+        <w:pStyle w:val="Choice"/>
+      </w:pPr>
+      <w:r>
         <w:t>c)</w:t>
         <w:tab/>
-        <w:t>El transmisor</w:t>
+        <w:t>El condensador</w:t>
       </w:r>
     </w:p>
     <w:p>
@@ -615,7 +615,7 @@
       <w:r>
         <w:t>c)</w:t>
         <w:tab/>
-        <w:t>NOR</w:t>
+        <w:t>TOR</w:t>
       </w:r>
     </w:p>
     <w:p>
@@ -625,7 +625,7 @@
       <w:r>
         <w:t>d)</w:t>
         <w:tab/>
-        <w:t>TOR</w:t>
+        <w:t>NOR</w:t>
       </w:r>
     </w:p>
     <w:p>
@@ -682,16 +682,6 @@
       <w:r>
         <w:t>a)</w:t>
         <w:tab/>
-        <w:t>NOT</w:t>
-      </w:r>
-    </w:p>
-    <w:p>
-      <w:pPr>
-        <w:pStyle w:val="Choice"/>
-      </w:pPr>
-      <w:r>
-        <w:t>b)</w:t>
-        <w:tab/>
         <w:t>AND</w:t>
       </w:r>
     </w:p>
@@ -700,7 +690,7 @@
         <w:pStyle w:val="Choice"/>
       </w:pPr>
       <w:r>
-        <w:t>c)</w:t>
+        <w:t>b)</w:t>
         <w:tab/>
         <w:t>NOR</w:t>
       </w:r>
@@ -710,9 +700,19 @@
         <w:pStyle w:val="Choice"/>
       </w:pPr>
       <w:r>
+        <w:t>c)</w:t>
+        <w:tab/>
+        <w:t>OR</w:t>
+      </w:r>
+    </w:p>
+    <w:p>
+      <w:pPr>
+        <w:pStyle w:val="Choice"/>
+      </w:pPr>
+      <w:r>
         <w:t>d)</w:t>
         <w:tab/>
-        <w:t>OR</w:t>
+        <w:t>NOT</w:t>
       </w:r>
     </w:p>
     <w:p>
@@ -769,7 +769,7 @@
       <w:r>
         <w:t>a)</w:t>
         <w:tab/>
-        <w:t>NOR</w:t>
+        <w:t>AND</w:t>
       </w:r>
     </w:p>
     <w:p>
@@ -778,16 +778,6 @@
       </w:pPr>
       <w:r>
         <w:t>b)</w:t>
-        <w:tab/>
-        <w:t>NOT</w:t>
-      </w:r>
-    </w:p>
-    <w:p>
-      <w:pPr>
-        <w:pStyle w:val="Choice"/>
-      </w:pPr>
-      <w:r>
-        <w:t>c)</w:t>
         <w:tab/>
         <w:t>OR</w:t>
       </w:r>
@@ -797,9 +787,19 @@
         <w:pStyle w:val="Choice"/>
       </w:pPr>
       <w:r>
+        <w:t>c)</w:t>
+        <w:tab/>
+        <w:t>NOR</w:t>
+      </w:r>
+    </w:p>
+    <w:p>
+      <w:pPr>
+        <w:pStyle w:val="Choice"/>
+      </w:pPr>
+      <w:r>
         <w:t>d)</w:t>
         <w:tab/>
-        <w:t>AND</w:t>
+        <w:t>NOT</w:t>
       </w:r>
     </w:p>
     <w:p>
@@ -866,7 +866,7 @@
       <w:r>
         <w:t>b)</w:t>
         <w:tab/>
-        <w:t>AND</w:t>
+        <w:t>NOR</w:t>
       </w:r>
     </w:p>
     <w:p>
@@ -876,7 +876,7 @@
       <w:r>
         <w:t>c)</w:t>
         <w:tab/>
-        <w:t>NOR</w:t>
+        <w:t>AND</w:t>
       </w:r>
     </w:p>
     <w:p>
@@ -943,6 +943,26 @@
       <w:r>
         <w:t>a)</w:t>
         <w:tab/>
+        <w:t>XNOR</w:t>
+      </w:r>
+    </w:p>
+    <w:p>
+      <w:pPr>
+        <w:pStyle w:val="Choice"/>
+      </w:pPr>
+      <w:r>
+        <w:t>b)</w:t>
+        <w:tab/>
+        <w:t>NOR</w:t>
+      </w:r>
+    </w:p>
+    <w:p>
+      <w:pPr>
+        <w:pStyle w:val="Choice"/>
+      </w:pPr>
+      <w:r>
+        <w:t>c)</w:t>
+        <w:tab/>
         <w:t>OR</w:t>
       </w:r>
     </w:p>
@@ -951,29 +971,9 @@
         <w:pStyle w:val="Choice"/>
       </w:pPr>
       <w:r>
-        <w:t>b)</w:t>
+        <w:t>d)</w:t>
         <w:tab/>
         <w:t>NOT</w:t>
-      </w:r>
-    </w:p>
-    <w:p>
-      <w:pPr>
-        <w:pStyle w:val="Choice"/>
-      </w:pPr>
-      <w:r>
-        <w:t>c)</w:t>
-        <w:tab/>
-        <w:t>XNOR</w:t>
-      </w:r>
-    </w:p>
-    <w:p>
-      <w:pPr>
-        <w:pStyle w:val="Choice"/>
-      </w:pPr>
-      <w:r>
-        <w:t>d)</w:t>
-        <w:tab/>
-        <w:t>NOR</w:t>
       </w:r>
     </w:p>
     <w:p>
@@ -1030,16 +1030,6 @@
       <w:r>
         <w:t>a)</w:t>
         <w:tab/>
-        <w:t>Ninguna</w:t>
-      </w:r>
-    </w:p>
-    <w:p>
-      <w:pPr>
-        <w:pStyle w:val="Choice"/>
-      </w:pPr>
-      <w:r>
-        <w:t>b)</w:t>
-        <w:tab/>
         <w:t>XOR</w:t>
       </w:r>
     </w:p>
@@ -1048,7 +1038,7 @@
         <w:pStyle w:val="Choice"/>
       </w:pPr>
       <w:r>
-        <w:t>c)</w:t>
+        <w:t>b)</w:t>
         <w:tab/>
         <w:t>NAND</w:t>
       </w:r>
@@ -1058,9 +1048,19 @@
         <w:pStyle w:val="Choice"/>
       </w:pPr>
       <w:r>
+        <w:t>c)</w:t>
+        <w:tab/>
+        <w:t>AND</w:t>
+      </w:r>
+    </w:p>
+    <w:p>
+      <w:pPr>
+        <w:pStyle w:val="Choice"/>
+      </w:pPr>
+      <w:r>
         <w:t>d)</w:t>
         <w:tab/>
-        <w:t>AND</w:t>
+        <w:t>Ninguna</w:t>
       </w:r>
     </w:p>
     <w:p>
@@ -1117,7 +1117,7 @@
       <w:r>
         <w:t>a)</w:t>
         <w:tab/>
-        <w:t>NAND</w:t>
+        <w:t>XOR</w:t>
       </w:r>
     </w:p>
     <w:p>
@@ -1137,7 +1137,7 @@
       <w:r>
         <w:t>c)</w:t>
         <w:tab/>
-        <w:t>XOR</w:t>
+        <w:t>OR</w:t>
       </w:r>
     </w:p>
     <w:p>
@@ -1147,7 +1147,7 @@
       <w:r>
         <w:t>d)</w:t>
         <w:tab/>
-        <w:t>OR</w:t>
+        <w:t>NAND</w:t>
       </w:r>
     </w:p>
     <w:p>
@@ -1204,7 +1204,7 @@
       <w:r>
         <w:t>a)</w:t>
         <w:tab/>
-        <w:t>Ninguna</w:t>
+        <w:t>NAND</w:t>
       </w:r>
     </w:p>
     <w:p>
@@ -1213,6 +1213,16 @@
       </w:pPr>
       <w:r>
         <w:t>b)</w:t>
+        <w:tab/>
+        <w:t>XOR</w:t>
+      </w:r>
+    </w:p>
+    <w:p>
+      <w:pPr>
+        <w:pStyle w:val="Choice"/>
+      </w:pPr>
+      <w:r>
+        <w:t>c)</w:t>
         <w:tab/>
         <w:t>XNOR</w:t>
       </w:r>
@@ -1222,19 +1232,9 @@
         <w:pStyle w:val="Choice"/>
       </w:pPr>
       <w:r>
-        <w:t>c)</w:t>
-        <w:tab/>
-        <w:t>XOR</w:t>
-      </w:r>
-    </w:p>
-    <w:p>
-      <w:pPr>
-        <w:pStyle w:val="Choice"/>
-      </w:pPr>
-      <w:r>
         <w:t>d)</w:t>
         <w:tab/>
-        <w:t>NAND</w:t>
+        <w:t>Ninguna</w:t>
       </w:r>
     </w:p>
     <w:p>
@@ -1291,7 +1291,7 @@
       <w:r>
         <w:t>a)</w:t>
         <w:tab/>
-        <w:t>Ninguna</w:t>
+        <w:t>AND</w:t>
       </w:r>
     </w:p>
     <w:p>
@@ -1300,6 +1300,16 @@
       </w:pPr>
       <w:r>
         <w:t>b)</w:t>
+        <w:tab/>
+        <w:t>XOR</w:t>
+      </w:r>
+    </w:p>
+    <w:p>
+      <w:pPr>
+        <w:pStyle w:val="Choice"/>
+      </w:pPr>
+      <w:r>
+        <w:t>c)</w:t>
         <w:tab/>
         <w:t>NOT</w:t>
       </w:r>
@@ -1309,19 +1319,9 @@
         <w:pStyle w:val="Choice"/>
       </w:pPr>
       <w:r>
-        <w:t>c)</w:t>
-        <w:tab/>
-        <w:t>AND</w:t>
-      </w:r>
-    </w:p>
-    <w:p>
-      <w:pPr>
-        <w:pStyle w:val="Choice"/>
-      </w:pPr>
-      <w:r>
         <w:t>d)</w:t>
         <w:tab/>
-        <w:t>XOR</w:t>
+        <w:t>Ninguna</w:t>
       </w:r>
     </w:p>
     <w:p>
@@ -1339,16 +1339,6 @@
       <w:r>
         <w:t>a)</w:t>
         <w:tab/>
-        <w:t>Charles Babbage</w:t>
-      </w:r>
-    </w:p>
-    <w:p>
-      <w:pPr>
-        <w:pStyle w:val="Choice"/>
-      </w:pPr>
-      <w:r>
-        <w:t>b)</w:t>
-        <w:tab/>
         <w:t>George Boole</w:t>
       </w:r>
     </w:p>
@@ -1357,7 +1347,7 @@
         <w:pStyle w:val="Choice"/>
       </w:pPr>
       <w:r>
-        <w:t>c)</w:t>
+        <w:t>b)</w:t>
         <w:tab/>
         <w:t>Bill Gates</w:t>
       </w:r>
@@ -1367,13 +1357,23 @@
         <w:pStyle w:val="Choice"/>
       </w:pPr>
       <w:r>
-        <w:t>d)</w:t>
+        <w:t>c)</w:t>
         <w:tab/>
         <w:t>William Shockley</w:t>
       </w:r>
     </w:p>
     <w:p>
       <w:pPr>
+        <w:pStyle w:val="Choice"/>
+      </w:pPr>
+      <w:r>
+        <w:t>d)</w:t>
+        <w:tab/>
+        <w:t>Charles Babbage</w:t>
+      </w:r>
+    </w:p>
+    <w:p>
+      <w:pPr>
         <w:pStyle w:val="ListNumber"/>
       </w:pPr>
       <w:r>
@@ -1387,6 +1387,16 @@
       <w:r>
         <w:t>a)</w:t>
         <w:tab/>
+        <w:t>1954</w:t>
+      </w:r>
+    </w:p>
+    <w:p>
+      <w:pPr>
+        <w:pStyle w:val="Choice"/>
+      </w:pPr>
+      <w:r>
+        <w:t>b)</w:t>
+        <w:tab/>
         <w:t>1854</w:t>
       </w:r>
     </w:p>
@@ -1395,19 +1405,9 @@
         <w:pStyle w:val="Choice"/>
       </w:pPr>
       <w:r>
-        <w:t>b)</w:t>
+        <w:t>c)</w:t>
         <w:tab/>
         <w:t>1934</w:t>
-      </w:r>
-    </w:p>
-    <w:p>
-      <w:pPr>
-        <w:pStyle w:val="Choice"/>
-      </w:pPr>
-      <w:r>
-        <w:t>c)</w:t>
-        <w:tab/>
-        <w:t>1954</w:t>
       </w:r>
     </w:p>
     <w:p>
@@ -1561,6 +1561,16 @@
       <w:r>
         <w:t>a)</w:t>
         <w:tab/>
+        <w:t>NOR</w:t>
+      </w:r>
+    </w:p>
+    <w:p>
+      <w:pPr>
+        <w:pStyle w:val="Choice"/>
+      </w:pPr>
+      <w:r>
+        <w:t>b)</w:t>
+        <w:tab/>
         <w:t>OR</w:t>
       </w:r>
     </w:p>
@@ -1569,9 +1579,9 @@
         <w:pStyle w:val="Choice"/>
       </w:pPr>
       <w:r>
-        <w:t>b)</w:t>
+        <w:t>c)</w:t>
         <w:tab/>
-        <w:t>NOR</w:t>
+        <w:t>NAND</w:t>
       </w:r>
     </w:p>
     <w:p>
@@ -1579,19 +1589,9 @@
         <w:pStyle w:val="Choice"/>
       </w:pPr>
       <w:r>
-        <w:t>c)</w:t>
+        <w:t>d)</w:t>
         <w:tab/>
         <w:t>AND</w:t>
-      </w:r>
-    </w:p>
-    <w:p>
-      <w:pPr>
-        <w:pStyle w:val="Choice"/>
-      </w:pPr>
-      <w:r>
-        <w:t>d)</w:t>
-        <w:tab/>
-        <w:t>NAND</w:t>
       </w:r>
     </w:p>
     <w:p>
@@ -1648,16 +1648,6 @@
       <w:r>
         <w:t>a)</w:t>
         <w:tab/>
-        <w:t>NAND</w:t>
-      </w:r>
-    </w:p>
-    <w:p>
-      <w:pPr>
-        <w:pStyle w:val="Choice"/>
-      </w:pPr>
-      <w:r>
-        <w:t>b)</w:t>
-        <w:tab/>
         <w:t>NOR</w:t>
       </w:r>
     </w:p>
@@ -1666,7 +1656,7 @@
         <w:pStyle w:val="Choice"/>
       </w:pPr>
       <w:r>
-        <w:t>c)</w:t>
+        <w:t>b)</w:t>
         <w:tab/>
         <w:t>AND</w:t>
       </w:r>
@@ -1676,9 +1666,19 @@
         <w:pStyle w:val="Choice"/>
       </w:pPr>
       <w:r>
+        <w:t>c)</w:t>
+        <w:tab/>
+        <w:t>OR</w:t>
+      </w:r>
+    </w:p>
+    <w:p>
+      <w:pPr>
+        <w:pStyle w:val="Choice"/>
+      </w:pPr>
+      <w:r>
         <w:t>d)</w:t>
         <w:tab/>
-        <w:t>OR</w:t>
+        <w:t>NAND</w:t>
       </w:r>
     </w:p>
     <w:p>
@@ -1735,6 +1735,26 @@
       <w:r>
         <w:t>a)</w:t>
         <w:tab/>
+        <w:t>OR</w:t>
+      </w:r>
+    </w:p>
+    <w:p>
+      <w:pPr>
+        <w:pStyle w:val="Choice"/>
+      </w:pPr>
+      <w:r>
+        <w:t>b)</w:t>
+        <w:tab/>
+        <w:t>NOR</w:t>
+      </w:r>
+    </w:p>
+    <w:p>
+      <w:pPr>
+        <w:pStyle w:val="Choice"/>
+      </w:pPr>
+      <w:r>
+        <w:t>c)</w:t>
+        <w:tab/>
         <w:t>AND</w:t>
       </w:r>
     </w:p>
@@ -1743,29 +1763,9 @@
         <w:pStyle w:val="Choice"/>
       </w:pPr>
       <w:r>
-        <w:t>b)</w:t>
-        <w:tab/>
-        <w:t>OR</w:t>
-      </w:r>
-    </w:p>
-    <w:p>
-      <w:pPr>
-        <w:pStyle w:val="Choice"/>
-      </w:pPr>
-      <w:r>
-        <w:t>c)</w:t>
+        <w:t>d)</w:t>
         <w:tab/>
         <w:t>NAND</w:t>
-      </w:r>
-    </w:p>
-    <w:p>
-      <w:pPr>
-        <w:pStyle w:val="Choice"/>
-      </w:pPr>
-      <w:r>
-        <w:t>d)</w:t>
-        <w:tab/>
-        <w:t>NOR</w:t>
       </w:r>
     </w:p>
     <w:p>
@@ -1842,7 +1842,7 @@
       <w:r>
         <w:t>c)</w:t>
         <w:tab/>
-        <w:t>NAND</w:t>
+        <w:t>TOR</w:t>
       </w:r>
     </w:p>
     <w:p>
@@ -1852,7 +1852,7 @@
       <w:r>
         <w:t>d)</w:t>
         <w:tab/>
-        <w:t>TOR</w:t>
+        <w:t>NAND</w:t>
       </w:r>
     </w:p>
     <w:p>
@@ -1909,6 +1909,16 @@
       <w:r>
         <w:t>a)</w:t>
         <w:tab/>
+        <w:t>NOT</w:t>
+      </w:r>
+    </w:p>
+    <w:p>
+      <w:pPr>
+        <w:pStyle w:val="Choice"/>
+      </w:pPr>
+      <w:r>
+        <w:t>b)</w:t>
+        <w:tab/>
         <w:t>XOR</w:t>
       </w:r>
     </w:p>
@@ -1917,7 +1927,7 @@
         <w:pStyle w:val="Choice"/>
       </w:pPr>
       <w:r>
-        <w:t>b)</w:t>
+        <w:t>c)</w:t>
         <w:tab/>
         <w:t>AND</w:t>
       </w:r>
@@ -1927,19 +1937,9 @@
         <w:pStyle w:val="Choice"/>
       </w:pPr>
       <w:r>
-        <w:t>c)</w:t>
+        <w:t>d)</w:t>
         <w:tab/>
         <w:t>OR</w:t>
-      </w:r>
-    </w:p>
-    <w:p>
-      <w:pPr>
-        <w:pStyle w:val="Choice"/>
-      </w:pPr>
-      <w:r>
-        <w:t>d)</w:t>
-        <w:tab/>
-        <w:t>NOT</w:t>
       </w:r>
     </w:p>
     <w:p>
@@ -1996,6 +1996,16 @@
       <w:r>
         <w:t>a)</w:t>
         <w:tab/>
+        <w:t>XOR</w:t>
+      </w:r>
+    </w:p>
+    <w:p>
+      <w:pPr>
+        <w:pStyle w:val="Choice"/>
+      </w:pPr>
+      <w:r>
+        <w:t>b)</w:t>
+        <w:tab/>
         <w:t>AND</w:t>
       </w:r>
     </w:p>
@@ -2004,7 +2014,7 @@
         <w:pStyle w:val="Choice"/>
       </w:pPr>
       <w:r>
-        <w:t>b)</w:t>
+        <w:t>c)</w:t>
         <w:tab/>
         <w:t>OR</w:t>
       </w:r>
@@ -2014,19 +2024,9 @@
         <w:pStyle w:val="Choice"/>
       </w:pPr>
       <w:r>
-        <w:t>c)</w:t>
+        <w:t>d)</w:t>
         <w:tab/>
         <w:t>NOT</w:t>
-      </w:r>
-    </w:p>
-    <w:p>
-      <w:pPr>
-        <w:pStyle w:val="Choice"/>
-      </w:pPr>
-      <w:r>
-        <w:t>d)</w:t>
-        <w:tab/>
-        <w:t>XOR</w:t>
       </w:r>
     </w:p>
     <w:p>
@@ -2083,16 +2083,6 @@
       <w:r>
         <w:t>a)</w:t>
         <w:tab/>
-        <w:t>OR</w:t>
-      </w:r>
-    </w:p>
-    <w:p>
-      <w:pPr>
-        <w:pStyle w:val="Choice"/>
-      </w:pPr>
-      <w:r>
-        <w:t>b)</w:t>
-        <w:tab/>
         <w:t>XOR</w:t>
       </w:r>
     </w:p>
@@ -2101,7 +2091,7 @@
         <w:pStyle w:val="Choice"/>
       </w:pPr>
       <w:r>
-        <w:t>c)</w:t>
+        <w:t>b)</w:t>
         <w:tab/>
         <w:t>AND</w:t>
       </w:r>
@@ -2111,9 +2101,19 @@
         <w:pStyle w:val="Choice"/>
       </w:pPr>
       <w:r>
+        <w:t>c)</w:t>
+        <w:tab/>
+        <w:t>NOT</w:t>
+      </w:r>
+    </w:p>
+    <w:p>
+      <w:pPr>
+        <w:pStyle w:val="Choice"/>
+      </w:pPr>
+      <w:r>
         <w:t>d)</w:t>
         <w:tab/>
-        <w:t>NOT</w:t>
+        <w:t>OR</w:t>
       </w:r>
     </w:p>
     <w:p>
@@ -2170,7 +2170,7 @@
       <w:r>
         <w:t>a)</w:t>
         <w:tab/>
-        <w:t>XOR</w:t>
+        <w:t>AND</w:t>
       </w:r>
     </w:p>
     <w:p>
@@ -2180,7 +2180,7 @@
       <w:r>
         <w:t>b)</w:t>
         <w:tab/>
-        <w:t>AND</w:t>
+        <w:t>XOR</w:t>
       </w:r>
     </w:p>
     <w:p>
@@ -2257,16 +2257,6 @@
       <w:r>
         <w:t>a)</w:t>
         <w:tab/>
-        <w:t>XOR</w:t>
-      </w:r>
-    </w:p>
-    <w:p>
-      <w:pPr>
-        <w:pStyle w:val="Choice"/>
-      </w:pPr>
-      <w:r>
-        <w:t>b)</w:t>
-        <w:tab/>
         <w:t>XNOR</w:t>
       </w:r>
     </w:p>
@@ -2275,7 +2265,7 @@
         <w:pStyle w:val="Choice"/>
       </w:pPr>
       <w:r>
-        <w:t>c)</w:t>
+        <w:t>b)</w:t>
         <w:tab/>
         <w:t>OR</w:t>
       </w:r>
@@ -2285,9 +2275,19 @@
         <w:pStyle w:val="Choice"/>
       </w:pPr>
       <w:r>
+        <w:t>c)</w:t>
+        <w:tab/>
+        <w:t>AND</w:t>
+      </w:r>
+    </w:p>
+    <w:p>
+      <w:pPr>
+        <w:pStyle w:val="Choice"/>
+      </w:pPr>
+      <w:r>
         <w:t>d)</w:t>
         <w:tab/>
-        <w:t>AND</w:t>
+        <w:t>XOR</w:t>
       </w:r>
     </w:p>
     <w:p>

</xml_diff>

<commit_message>
Corregidos títulos y puntos finales
</commit_message>
<xml_diff>
--- a/build/es_electric_digital.docx
+++ b/build/es_electric_digital.docx
@@ -64,7 +64,7 @@
       <w:r>
         <w:t>a)</w:t>
         <w:tab/>
-        <w:t>Puerta NOT</w:t>
+        <w:t>Puerta AND</w:t>
       </w:r>
     </w:p>
     <w:p>
@@ -84,7 +84,7 @@
       <w:r>
         <w:t>c)</w:t>
         <w:tab/>
-        <w:t>Puerta AND</w:t>
+        <w:t>Puerta XOR</w:t>
       </w:r>
     </w:p>
     <w:p>
@@ -94,7 +94,7 @@
       <w:r>
         <w:t>d)</w:t>
         <w:tab/>
-        <w:t>Puerta XOR</w:t>
+        <w:t>Puerta NOT</w:t>
       </w:r>
     </w:p>
     <w:p>
@@ -151,6 +151,16 @@
       <w:r>
         <w:t>a)</w:t>
         <w:tab/>
+        <w:t>Puerta XOR</w:t>
+      </w:r>
+    </w:p>
+    <w:p>
+      <w:pPr>
+        <w:pStyle w:val="Choice"/>
+      </w:pPr>
+      <w:r>
+        <w:t>b)</w:t>
+        <w:tab/>
         <w:t>Puerta NOR</w:t>
       </w:r>
     </w:p>
@@ -159,7 +169,7 @@
         <w:pStyle w:val="Choice"/>
       </w:pPr>
       <w:r>
-        <w:t>b)</w:t>
+        <w:t>c)</w:t>
         <w:tab/>
         <w:t>Puerta NAND</w:t>
       </w:r>
@@ -169,19 +179,9 @@
         <w:pStyle w:val="Choice"/>
       </w:pPr>
       <w:r>
-        <w:t>c)</w:t>
+        <w:t>d)</w:t>
         <w:tab/>
         <w:t>Puerta NOT</w:t>
-      </w:r>
-    </w:p>
-    <w:p>
-      <w:pPr>
-        <w:pStyle w:val="Choice"/>
-      </w:pPr>
-      <w:r>
-        <w:t>d)</w:t>
-        <w:tab/>
-        <w:t>Puerta XOR</w:t>
       </w:r>
     </w:p>
     <w:p>
@@ -238,6 +238,26 @@
       <w:r>
         <w:t>a)</w:t>
         <w:tab/>
+        <w:t>Puerta XOR</w:t>
+      </w:r>
+    </w:p>
+    <w:p>
+      <w:pPr>
+        <w:pStyle w:val="Choice"/>
+      </w:pPr>
+      <w:r>
+        <w:t>b)</w:t>
+        <w:tab/>
+        <w:t>Puerta OR</w:t>
+      </w:r>
+    </w:p>
+    <w:p>
+      <w:pPr>
+        <w:pStyle w:val="Choice"/>
+      </w:pPr>
+      <w:r>
+        <w:t>c)</w:t>
+        <w:tab/>
         <w:t>Puerta AND</w:t>
       </w:r>
     </w:p>
@@ -246,29 +266,9 @@
         <w:pStyle w:val="Choice"/>
       </w:pPr>
       <w:r>
-        <w:t>b)</w:t>
+        <w:t>d)</w:t>
         <w:tab/>
         <w:t>Puerta NOT</w:t>
-      </w:r>
-    </w:p>
-    <w:p>
-      <w:pPr>
-        <w:pStyle w:val="Choice"/>
-      </w:pPr>
-      <w:r>
-        <w:t>c)</w:t>
-        <w:tab/>
-        <w:t>Puerta XOR</w:t>
-      </w:r>
-    </w:p>
-    <w:p>
-      <w:pPr>
-        <w:pStyle w:val="Choice"/>
-      </w:pPr>
-      <w:r>
-        <w:t>d)</w:t>
-        <w:tab/>
-        <w:t>Puerta OR</w:t>
       </w:r>
     </w:p>
     <w:p>
@@ -325,6 +325,26 @@
       <w:r>
         <w:t>a)</w:t>
         <w:tab/>
+        <w:t>Puerta NOT</w:t>
+      </w:r>
+    </w:p>
+    <w:p>
+      <w:pPr>
+        <w:pStyle w:val="Choice"/>
+      </w:pPr>
+      <w:r>
+        <w:t>b)</w:t>
+        <w:tab/>
+        <w:t>Puerta XOR</w:t>
+      </w:r>
+    </w:p>
+    <w:p>
+      <w:pPr>
+        <w:pStyle w:val="Choice"/>
+      </w:pPr>
+      <w:r>
+        <w:t>c)</w:t>
+        <w:tab/>
         <w:t>Puerta NAND</w:t>
       </w:r>
     </w:p>
@@ -333,29 +353,9 @@
         <w:pStyle w:val="Choice"/>
       </w:pPr>
       <w:r>
-        <w:t>b)</w:t>
+        <w:t>d)</w:t>
         <w:tab/>
         <w:t>Puerta NOR</w:t>
-      </w:r>
-    </w:p>
-    <w:p>
-      <w:pPr>
-        <w:pStyle w:val="Choice"/>
-      </w:pPr>
-      <w:r>
-        <w:t>c)</w:t>
-        <w:tab/>
-        <w:t>Puerta NOT</w:t>
-      </w:r>
-    </w:p>
-    <w:p>
-      <w:pPr>
-        <w:pStyle w:val="Choice"/>
-      </w:pPr>
-      <w:r>
-        <w:t>d)</w:t>
-        <w:tab/>
-        <w:t>Puerta XOR</w:t>
       </w:r>
     </w:p>
     <w:p>
@@ -422,16 +422,6 @@
       <w:r>
         <w:t>b)</w:t>
         <w:tab/>
-        <w:t>Puerta OR</w:t>
-      </w:r>
-    </w:p>
-    <w:p>
-      <w:pPr>
-        <w:pStyle w:val="Choice"/>
-      </w:pPr>
-      <w:r>
-        <w:t>c)</w:t>
-        <w:tab/>
         <w:t>Puerta AND</w:t>
       </w:r>
     </w:p>
@@ -440,9 +430,19 @@
         <w:pStyle w:val="Choice"/>
       </w:pPr>
       <w:r>
+        <w:t>c)</w:t>
+        <w:tab/>
+        <w:t>Puerta NOT</w:t>
+      </w:r>
+    </w:p>
+    <w:p>
+      <w:pPr>
+        <w:pStyle w:val="Choice"/>
+      </w:pPr>
+      <w:r>
         <w:t>d)</w:t>
         <w:tab/>
-        <w:t>Puerta NOT</w:t>
+        <w:t>Puerta OR</w:t>
       </w:r>
     </w:p>
     <w:p>
@@ -499,7 +499,7 @@
       <w:r>
         <w:t>a)</w:t>
         <w:tab/>
-        <w:t>Puerta NAND</w:t>
+        <w:t>Puerta NOT</w:t>
       </w:r>
     </w:p>
     <w:p>
@@ -529,7 +529,7 @@
       <w:r>
         <w:t>d)</w:t>
         <w:tab/>
-        <w:t>Puerta NOT</w:t>
+        <w:t>Puerta NAND</w:t>
       </w:r>
     </w:p>
     <w:p>
@@ -547,6 +547,26 @@
       <w:r>
         <w:t>a)</w:t>
         <w:tab/>
+        <w:t>El condensador</w:t>
+      </w:r>
+    </w:p>
+    <w:p>
+      <w:pPr>
+        <w:pStyle w:val="Choice"/>
+      </w:pPr>
+      <w:r>
+        <w:t>b)</w:t>
+        <w:tab/>
+        <w:t>El transistor</w:t>
+      </w:r>
+    </w:p>
+    <w:p>
+      <w:pPr>
+        <w:pStyle w:val="Choice"/>
+      </w:pPr>
+      <w:r>
+        <w:t>c)</w:t>
+        <w:tab/>
         <w:t>El transmisor</w:t>
       </w:r>
     </w:p>
@@ -555,33 +575,13 @@
         <w:pStyle w:val="Choice"/>
       </w:pPr>
       <w:r>
-        <w:t>b)</w:t>
-        <w:tab/>
-        <w:t>El condensador</w:t>
-      </w:r>
-    </w:p>
-    <w:p>
-      <w:pPr>
-        <w:pStyle w:val="Choice"/>
-      </w:pPr>
-      <w:r>
-        <w:t>c)</w:t>
+        <w:t>d)</w:t>
         <w:tab/>
         <w:t>La resistencia</w:t>
       </w:r>
     </w:p>
     <w:p>
       <w:pPr>
-        <w:pStyle w:val="Choice"/>
-      </w:pPr>
-      <w:r>
-        <w:t>d)</w:t>
-        <w:tab/>
-        <w:t>El transistor</w:t>
-      </w:r>
-    </w:p>
-    <w:p>
-      <w:pPr>
         <w:pStyle w:val="ListNumber"/>
       </w:pPr>
       <w:r>
@@ -595,7 +595,7 @@
       <w:r>
         <w:t>a)</w:t>
         <w:tab/>
-        <w:t>NOR</w:t>
+        <w:t>XOR</w:t>
       </w:r>
     </w:p>
     <w:p>
@@ -615,7 +615,7 @@
       <w:r>
         <w:t>c)</w:t>
         <w:tab/>
-        <w:t>TOR</w:t>
+        <w:t>NOR</w:t>
       </w:r>
     </w:p>
     <w:p>
@@ -625,7 +625,7 @@
       <w:r>
         <w:t>d)</w:t>
         <w:tab/>
-        <w:t>XOR</w:t>
+        <w:t>TOR</w:t>
       </w:r>
     </w:p>
     <w:p>
@@ -692,7 +692,7 @@
       <w:r>
         <w:t>b)</w:t>
         <w:tab/>
-        <w:t>NOR</w:t>
+        <w:t>AND</w:t>
       </w:r>
     </w:p>
     <w:p>
@@ -702,7 +702,7 @@
       <w:r>
         <w:t>c)</w:t>
         <w:tab/>
-        <w:t>AND</w:t>
+        <w:t>NOR</w:t>
       </w:r>
     </w:p>
     <w:p>
@@ -769,6 +769,26 @@
       <w:r>
         <w:t>a)</w:t>
         <w:tab/>
+        <w:t>NOR</w:t>
+      </w:r>
+    </w:p>
+    <w:p>
+      <w:pPr>
+        <w:pStyle w:val="Choice"/>
+      </w:pPr>
+      <w:r>
+        <w:t>b)</w:t>
+        <w:tab/>
+        <w:t>NOT</w:t>
+      </w:r>
+    </w:p>
+    <w:p>
+      <w:pPr>
+        <w:pStyle w:val="Choice"/>
+      </w:pPr>
+      <w:r>
+        <w:t>c)</w:t>
+        <w:tab/>
         <w:t>OR</w:t>
       </w:r>
     </w:p>
@@ -777,29 +797,9 @@
         <w:pStyle w:val="Choice"/>
       </w:pPr>
       <w:r>
-        <w:t>b)</w:t>
+        <w:t>d)</w:t>
         <w:tab/>
         <w:t>AND</w:t>
-      </w:r>
-    </w:p>
-    <w:p>
-      <w:pPr>
-        <w:pStyle w:val="Choice"/>
-      </w:pPr>
-      <w:r>
-        <w:t>c)</w:t>
-        <w:tab/>
-        <w:t>NOR</w:t>
-      </w:r>
-    </w:p>
-    <w:p>
-      <w:pPr>
-        <w:pStyle w:val="Choice"/>
-      </w:pPr>
-      <w:r>
-        <w:t>d)</w:t>
-        <w:tab/>
-        <w:t>NOT</w:t>
       </w:r>
     </w:p>
     <w:p>
@@ -876,7 +876,7 @@
       <w:r>
         <w:t>c)</w:t>
         <w:tab/>
-        <w:t>OR</w:t>
+        <w:t>NOR</w:t>
       </w:r>
     </w:p>
     <w:p>
@@ -886,7 +886,7 @@
       <w:r>
         <w:t>d)</w:t>
         <w:tab/>
-        <w:t>NOR</w:t>
+        <w:t>OR</w:t>
       </w:r>
     </w:p>
     <w:p>
@@ -963,7 +963,7 @@
       <w:r>
         <w:t>c)</w:t>
         <w:tab/>
-        <w:t>NOR</w:t>
+        <w:t>XNOR</w:t>
       </w:r>
     </w:p>
     <w:p>
@@ -973,7 +973,7 @@
       <w:r>
         <w:t>d)</w:t>
         <w:tab/>
-        <w:t>XNOR</w:t>
+        <w:t>NOR</w:t>
       </w:r>
     </w:p>
     <w:p>
@@ -1030,7 +1030,7 @@
       <w:r>
         <w:t>a)</w:t>
         <w:tab/>
-        <w:t>NAND</w:t>
+        <w:t>Ninguna</w:t>
       </w:r>
     </w:p>
     <w:p>
@@ -1050,7 +1050,7 @@
       <w:r>
         <w:t>c)</w:t>
         <w:tab/>
-        <w:t>AND</w:t>
+        <w:t>NAND</w:t>
       </w:r>
     </w:p>
     <w:p>
@@ -1060,7 +1060,7 @@
       <w:r>
         <w:t>d)</w:t>
         <w:tab/>
-        <w:t>Ninguna</w:t>
+        <w:t>AND</w:t>
       </w:r>
     </w:p>
     <w:p>
@@ -1117,6 +1117,16 @@
       <w:r>
         <w:t>a)</w:t>
         <w:tab/>
+        <w:t>NAND</w:t>
+      </w:r>
+    </w:p>
+    <w:p>
+      <w:pPr>
+        <w:pStyle w:val="Choice"/>
+      </w:pPr>
+      <w:r>
+        <w:t>b)</w:t>
+        <w:tab/>
         <w:t>XNOR</w:t>
       </w:r>
     </w:p>
@@ -1125,9 +1135,9 @@
         <w:pStyle w:val="Choice"/>
       </w:pPr>
       <w:r>
-        <w:t>b)</w:t>
+        <w:t>c)</w:t>
         <w:tab/>
-        <w:t>NAND</w:t>
+        <w:t>XOR</w:t>
       </w:r>
     </w:p>
     <w:p>
@@ -1135,19 +1145,9 @@
         <w:pStyle w:val="Choice"/>
       </w:pPr>
       <w:r>
-        <w:t>c)</w:t>
+        <w:t>d)</w:t>
         <w:tab/>
         <w:t>OR</w:t>
-      </w:r>
-    </w:p>
-    <w:p>
-      <w:pPr>
-        <w:pStyle w:val="Choice"/>
-      </w:pPr>
-      <w:r>
-        <w:t>d)</w:t>
-        <w:tab/>
-        <w:t>XOR</w:t>
       </w:r>
     </w:p>
     <w:p>
@@ -1204,7 +1204,7 @@
       <w:r>
         <w:t>a)</w:t>
         <w:tab/>
-        <w:t>XOR</w:t>
+        <w:t>Ninguna</w:t>
       </w:r>
     </w:p>
     <w:p>
@@ -1224,7 +1224,7 @@
       <w:r>
         <w:t>c)</w:t>
         <w:tab/>
-        <w:t>NAND</w:t>
+        <w:t>XOR</w:t>
       </w:r>
     </w:p>
     <w:p>
@@ -1234,7 +1234,7 @@
       <w:r>
         <w:t>d)</w:t>
         <w:tab/>
-        <w:t>Ninguna</w:t>
+        <w:t>NAND</w:t>
       </w:r>
     </w:p>
     <w:p>
@@ -1291,6 +1291,16 @@
       <w:r>
         <w:t>a)</w:t>
         <w:tab/>
+        <w:t>Ninguna</w:t>
+      </w:r>
+    </w:p>
+    <w:p>
+      <w:pPr>
+        <w:pStyle w:val="Choice"/>
+      </w:pPr>
+      <w:r>
+        <w:t>b)</w:t>
+        <w:tab/>
         <w:t>NOT</w:t>
       </w:r>
     </w:p>
@@ -1299,7 +1309,7 @@
         <w:pStyle w:val="Choice"/>
       </w:pPr>
       <w:r>
-        <w:t>b)</w:t>
+        <w:t>c)</w:t>
         <w:tab/>
         <w:t>AND</w:t>
       </w:r>
@@ -1309,23 +1319,13 @@
         <w:pStyle w:val="Choice"/>
       </w:pPr>
       <w:r>
-        <w:t>c)</w:t>
+        <w:t>d)</w:t>
         <w:tab/>
         <w:t>XOR</w:t>
       </w:r>
     </w:p>
     <w:p>
       <w:pPr>
-        <w:pStyle w:val="Choice"/>
-      </w:pPr>
-      <w:r>
-        <w:t>d)</w:t>
-        <w:tab/>
-        <w:t>Ninguna</w:t>
-      </w:r>
-    </w:p>
-    <w:p>
-      <w:pPr>
         <w:pStyle w:val="ListNumber"/>
       </w:pPr>
       <w:r>
@@ -1339,7 +1339,7 @@
       <w:r>
         <w:t>a)</w:t>
         <w:tab/>
-        <w:t>William Shockley</w:t>
+        <w:t>Charles Babbage</w:t>
       </w:r>
     </w:p>
     <w:p>
@@ -1349,7 +1349,7 @@
       <w:r>
         <w:t>b)</w:t>
         <w:tab/>
-        <w:t>Charles Babbage</w:t>
+        <w:t>George Boole</w:t>
       </w:r>
     </w:p>
     <w:p>
@@ -1369,7 +1369,7 @@
       <w:r>
         <w:t>d)</w:t>
         <w:tab/>
-        <w:t>George Boole</w:t>
+        <w:t>William Shockley</w:t>
       </w:r>
     </w:p>
     <w:p>
@@ -1387,6 +1387,26 @@
       <w:r>
         <w:t>a)</w:t>
         <w:tab/>
+        <w:t>1854</w:t>
+      </w:r>
+    </w:p>
+    <w:p>
+      <w:pPr>
+        <w:pStyle w:val="Choice"/>
+      </w:pPr>
+      <w:r>
+        <w:t>b)</w:t>
+        <w:tab/>
+        <w:t>1934</w:t>
+      </w:r>
+    </w:p>
+    <w:p>
+      <w:pPr>
+        <w:pStyle w:val="Choice"/>
+      </w:pPr>
+      <w:r>
+        <w:t>c)</w:t>
+        <w:tab/>
         <w:t>1954</w:t>
       </w:r>
     </w:p>
@@ -1395,29 +1415,9 @@
         <w:pStyle w:val="Choice"/>
       </w:pPr>
       <w:r>
-        <w:t>b)</w:t>
-        <w:tab/>
-        <w:t>1854</w:t>
-      </w:r>
-    </w:p>
-    <w:p>
-      <w:pPr>
-        <w:pStyle w:val="Choice"/>
-      </w:pPr>
-      <w:r>
-        <w:t>c)</w:t>
+        <w:t>d)</w:t>
         <w:tab/>
         <w:t>1904</w:t>
-      </w:r>
-    </w:p>
-    <w:p>
-      <w:pPr>
-        <w:pStyle w:val="Choice"/>
-      </w:pPr>
-      <w:r>
-        <w:t>d)</w:t>
-        <w:tab/>
-        <w:t>1934</w:t>
       </w:r>
     </w:p>
     <w:p>
@@ -1474,16 +1474,6 @@
       <w:r>
         <w:t>a)</w:t>
         <w:tab/>
-        <w:t>AND</w:t>
-      </w:r>
-    </w:p>
-    <w:p>
-      <w:pPr>
-        <w:pStyle w:val="Choice"/>
-      </w:pPr>
-      <w:r>
-        <w:t>b)</w:t>
-        <w:tab/>
         <w:t>NAND</w:t>
       </w:r>
     </w:p>
@@ -1492,7 +1482,7 @@
         <w:pStyle w:val="Choice"/>
       </w:pPr>
       <w:r>
-        <w:t>c)</w:t>
+        <w:t>b)</w:t>
         <w:tab/>
         <w:t>NOR</w:t>
       </w:r>
@@ -1502,9 +1492,19 @@
         <w:pStyle w:val="Choice"/>
       </w:pPr>
       <w:r>
+        <w:t>c)</w:t>
+        <w:tab/>
+        <w:t>OR</w:t>
+      </w:r>
+    </w:p>
+    <w:p>
+      <w:pPr>
+        <w:pStyle w:val="Choice"/>
+      </w:pPr>
+      <w:r>
         <w:t>d)</w:t>
         <w:tab/>
-        <w:t>OR</w:t>
+        <w:t>AND</w:t>
       </w:r>
     </w:p>
     <w:p>
@@ -1561,7 +1561,7 @@
       <w:r>
         <w:t>a)</w:t>
         <w:tab/>
-        <w:t>NAND</w:t>
+        <w:t>OR</w:t>
       </w:r>
     </w:p>
     <w:p>
@@ -1591,7 +1591,7 @@
       <w:r>
         <w:t>d)</w:t>
         <w:tab/>
-        <w:t>OR</w:t>
+        <w:t>NAND</w:t>
       </w:r>
     </w:p>
     <w:p>
@@ -1658,7 +1658,7 @@
       <w:r>
         <w:t>b)</w:t>
         <w:tab/>
-        <w:t>AND</w:t>
+        <w:t>NOR</w:t>
       </w:r>
     </w:p>
     <w:p>
@@ -1668,7 +1668,7 @@
       <w:r>
         <w:t>c)</w:t>
         <w:tab/>
-        <w:t>NOR</w:t>
+        <w:t>AND</w:t>
       </w:r>
     </w:p>
     <w:p>
@@ -1735,16 +1735,6 @@
       <w:r>
         <w:t>a)</w:t>
         <w:tab/>
-        <w:t>NOR</w:t>
-      </w:r>
-    </w:p>
-    <w:p>
-      <w:pPr>
-        <w:pStyle w:val="Choice"/>
-      </w:pPr>
-      <w:r>
-        <w:t>b)</w:t>
-        <w:tab/>
         <w:t>AND</w:t>
       </w:r>
     </w:p>
@@ -1753,7 +1743,7 @@
         <w:pStyle w:val="Choice"/>
       </w:pPr>
       <w:r>
-        <w:t>c)</w:t>
+        <w:t>b)</w:t>
         <w:tab/>
         <w:t>OR</w:t>
       </w:r>
@@ -1763,9 +1753,19 @@
         <w:pStyle w:val="Choice"/>
       </w:pPr>
       <w:r>
+        <w:t>c)</w:t>
+        <w:tab/>
+        <w:t>NAND</w:t>
+      </w:r>
+    </w:p>
+    <w:p>
+      <w:pPr>
+        <w:pStyle w:val="Choice"/>
+      </w:pPr>
+      <w:r>
         <w:t>d)</w:t>
         <w:tab/>
-        <w:t>NAND</w:t>
+        <w:t>NOR</w:t>
       </w:r>
     </w:p>
     <w:p>
@@ -1822,7 +1822,7 @@
       <w:r>
         <w:t>a)</w:t>
         <w:tab/>
-        <w:t>NOT</w:t>
+        <w:t>NOR</w:t>
       </w:r>
     </w:p>
     <w:p>
@@ -1832,7 +1832,7 @@
       <w:r>
         <w:t>b)</w:t>
         <w:tab/>
-        <w:t>NOR</w:t>
+        <w:t>NOT</w:t>
       </w:r>
     </w:p>
     <w:p>
@@ -1909,7 +1909,7 @@
       <w:r>
         <w:t>a)</w:t>
         <w:tab/>
-        <w:t>NOT</w:t>
+        <w:t>XOR</w:t>
       </w:r>
     </w:p>
     <w:p>
@@ -1919,7 +1919,7 @@
       <w:r>
         <w:t>b)</w:t>
         <w:tab/>
-        <w:t>XOR</w:t>
+        <w:t>AND</w:t>
       </w:r>
     </w:p>
     <w:p>
@@ -1939,7 +1939,7 @@
       <w:r>
         <w:t>d)</w:t>
         <w:tab/>
-        <w:t>AND</w:t>
+        <w:t>NOT</w:t>
       </w:r>
     </w:p>
     <w:p>
@@ -1996,7 +1996,7 @@
       <w:r>
         <w:t>a)</w:t>
         <w:tab/>
-        <w:t>OR</w:t>
+        <w:t>AND</w:t>
       </w:r>
     </w:p>
     <w:p>
@@ -2006,7 +2006,7 @@
       <w:r>
         <w:t>b)</w:t>
         <w:tab/>
-        <w:t>AND</w:t>
+        <w:t>OR</w:t>
       </w:r>
     </w:p>
     <w:p>
@@ -2103,7 +2103,7 @@
       <w:r>
         <w:t>c)</w:t>
         <w:tab/>
-        <w:t>NOT</w:t>
+        <w:t>AND</w:t>
       </w:r>
     </w:p>
     <w:p>
@@ -2113,7 +2113,7 @@
       <w:r>
         <w:t>d)</w:t>
         <w:tab/>
-        <w:t>AND</w:t>
+        <w:t>NOT</w:t>
       </w:r>
     </w:p>
     <w:p>
@@ -2170,6 +2170,26 @@
       <w:r>
         <w:t>a)</w:t>
         <w:tab/>
+        <w:t>XOR</w:t>
+      </w:r>
+    </w:p>
+    <w:p>
+      <w:pPr>
+        <w:pStyle w:val="Choice"/>
+      </w:pPr>
+      <w:r>
+        <w:t>b)</w:t>
+        <w:tab/>
+        <w:t>AND</w:t>
+      </w:r>
+    </w:p>
+    <w:p>
+      <w:pPr>
+        <w:pStyle w:val="Choice"/>
+      </w:pPr>
+      <w:r>
+        <w:t>c)</w:t>
+        <w:tab/>
         <w:t>OR</w:t>
       </w:r>
     </w:p>
@@ -2178,29 +2198,9 @@
         <w:pStyle w:val="Choice"/>
       </w:pPr>
       <w:r>
-        <w:t>b)</w:t>
-        <w:tab/>
-        <w:t>XOR</w:t>
-      </w:r>
-    </w:p>
-    <w:p>
-      <w:pPr>
-        <w:pStyle w:val="Choice"/>
-      </w:pPr>
-      <w:r>
-        <w:t>c)</w:t>
+        <w:t>d)</w:t>
         <w:tab/>
         <w:t>XNOR</w:t>
-      </w:r>
-    </w:p>
-    <w:p>
-      <w:pPr>
-        <w:pStyle w:val="Choice"/>
-      </w:pPr>
-      <w:r>
-        <w:t>d)</w:t>
-        <w:tab/>
-        <w:t>AND</w:t>
       </w:r>
     </w:p>
     <w:p>
@@ -2257,7 +2257,7 @@
       <w:r>
         <w:t>a)</w:t>
         <w:tab/>
-        <w:t>AND</w:t>
+        <w:t>XOR</w:t>
       </w:r>
     </w:p>
     <w:p>
@@ -2267,7 +2267,7 @@
       <w:r>
         <w:t>b)</w:t>
         <w:tab/>
-        <w:t>XOR</w:t>
+        <w:t>XNOR</w:t>
       </w:r>
     </w:p>
     <w:p>
@@ -2287,7 +2287,7 @@
       <w:r>
         <w:t>d)</w:t>
         <w:tab/>
-        <w:t>XNOR</w:t>
+        <w:t>AND</w:t>
       </w:r>
     </w:p>
     <w:p>
@@ -2354,7 +2354,7 @@
       <w:r>
         <w:t>b)</w:t>
         <w:tab/>
-        <w:t>NOR</w:t>
+        <w:t>OR</w:t>
       </w:r>
     </w:p>
     <w:p>
@@ -2364,7 +2364,7 @@
       <w:r>
         <w:t>c)</w:t>
         <w:tab/>
-        <w:t>OR</w:t>
+        <w:t>NOR</w:t>
       </w:r>
     </w:p>
     <w:p>

</xml_diff>